<commit_message>
UPDATED OCTOBER 7 2026
</commit_message>
<xml_diff>
--- a/public/resume/Kyle-Ryan-Austria-Resume-ATS.docx
+++ b/public/resume/Kyle-Ryan-Austria-Resume-ATS.docx
@@ -53,7 +53,7 @@
           <w:sz w:val="18"/>
           <w:szCs w:val="18"/>
         </w:rPr>
-        <w:t xml:space="preserve">Pampanga, Philippines   ·   +63 976 272 2124   ·   kyleryanaustria@gmail.com   ·   linkedin.com/in/kyle-austria   ·   github.com/KyleAustria01</w:t>
+        <w:t xml:space="preserve">Pampanga, Philippines   ·   +63 976 272 2124   ·   kyleryanaustria@gmail.com   ·   linkedin.com/in/kyle-austria   ·   github.com/KyleAustria01   ·   kyleaustria.com</w:t>
       </w:r>
     </w:p>
     <w:p>
@@ -91,7 +91,7 @@
           <w:sz w:val="21"/>
           <w:szCs w:val="21"/>
         </w:rPr>
-        <w:t xml:space="preserve">Full Stack Developer with 4+ years of experience building enterprise platforms in production, specializing in Angular on the front end and Laravel on the back end, with deep AWS experience. Built the internal CRM and operations platform Clark Outsourcing runs on, plus a separate payroll system with full Philippine statutory compliance. Currently integrating AI into company workflows through RAG pipelines with Pinecone and Elasticsearch.</w:t>
+        <w:t xml:space="preserve">Full Stack Developer with 4+ years of experience building enterprise platforms in production, specializing in Angular on the front end and Laravel on the back end, with deep AWS experience. Built the internal CRM and operations platform Clark Outsourcing runs on, plus a separate payroll system with full Philippine statutory compliance. Most recently brought AI into company workflows through RAG pipelines with Pinecone and Elasticsearch. Available for full-time and contract remote roles from November 2026.</w:t>
       </w:r>
     </w:p>
     <w:p>
@@ -175,26 +175,26 @@
           <w:sz w:val="18"/>
           <w:szCs w:val="18"/>
         </w:rPr>
-        <w:t xml:space="preserve">	May 2022 – Present</w:t>
-      </w:r>
-    </w:p>
-    <w:p>
-      <w:pPr>
-        <w:pStyle w:val="ListParagraph"/>
-        <w:numPr>
-          <w:ilvl w:val="0"/>
-          <w:numId w:val="2"/>
-        </w:numPr>
-        <w:spacing w:after="10"/>
-      </w:pPr>
-      <w:r>
-        <w:rPr>
-          <w:rFonts w:ascii="Calibri" w:cs="Calibri" w:eastAsia="Calibri" w:hAnsi="Calibri"/>
-          <w:color w:val="2B2B2B"/>
-          <w:sz w:val="21"/>
-          <w:szCs w:val="21"/>
-        </w:rPr>
-        <w:t xml:space="preserve">Built and maintain the internal CRM &amp; operations platform – employee lifecycle, helpdesk ticketing, and the Airtable/Zoho automation layer that ties them together</w:t>
+        <w:t xml:space="preserve">	May 2022 – Oct 2026</w:t>
+      </w:r>
+    </w:p>
+    <w:p>
+      <w:pPr>
+        <w:pStyle w:val="ListParagraph"/>
+        <w:numPr>
+          <w:ilvl w:val="0"/>
+          <w:numId w:val="2"/>
+        </w:numPr>
+        <w:spacing w:after="10"/>
+      </w:pPr>
+      <w:r>
+        <w:rPr>
+          <w:rFonts w:ascii="Calibri" w:cs="Calibri" w:eastAsia="Calibri" w:hAnsi="Calibri"/>
+          <w:color w:val="2B2B2B"/>
+          <w:sz w:val="21"/>
+          <w:szCs w:val="21"/>
+        </w:rPr>
+        <w:t xml:space="preserve">Built and maintained the internal CRM &amp; operations platform – employee lifecycle, helpdesk ticketing, and the Airtable/Zoho automation layer that ties them together</w:t>
       </w:r>
     </w:p>
     <w:p>
@@ -251,7 +251,7 @@
           <w:sz w:val="21"/>
           <w:szCs w:val="21"/>
         </w:rPr>
-        <w:t xml:space="preserve">Integrating AI into company processes – RAG pipelines with Pinecone and Elasticsearch for retrieval over internal knowledge</w:t>
+        <w:t xml:space="preserve">Brought AI into company processes – RAG pipelines with Pinecone and Elasticsearch for retrieval over internal knowledge</w:t>
       </w:r>
     </w:p>
     <w:p>

</xml_diff>